<commit_message>
fix: 修复 leads 表 collation 冲突导致 post sensitive-info 查询报错
两个查询点加 COLLATE utf8mb4_unicode_ci：
1. leads.post_id = ? COLLATE utf8mb4_unicode_ci
2. leads.id = orders.lead_id COLLATE utf8mb4_unicode_ci

leads 表是 utf8mb4_unicode_ci，而默认连接 / orders 表是
utf8mb4_0900_ai_ci，= 操作时报 Illegal mix of collations
</commit_message>
<xml_diff>
--- a/bugs20260606.docx
+++ b/bugs20260606.docx
@@ -932,6 +932,11 @@
       </w:r>
     </w:p>
     <w:p>
+      <w:pPr>
+        <w:rPr>
+          <w:rFonts w:hint="eastAsia"/>
+        </w:rPr>
+      </w:pPr>
       <w:r>
         <w:rPr>
           <w:rFonts w:hint="eastAsia"/>
@@ -939,23 +944,6 @@
         <w:t>来源作品只显示几个字，不要显示成分行，触碰后悬浮框显示原名，点击可跳转至对应作品</w:t>
       </w:r>
     </w:p>
-    <w:p/>
-    <w:p/>
-    <w:p/>
-    <w:p/>
-    <w:p/>
-    <w:p/>
-    <w:p/>
-    <w:p/>
-    <w:p/>
-    <w:p/>
-    <w:p/>
-    <w:p/>
-    <w:p/>
-    <w:p/>
-    <w:p/>
-    <w:p/>
-    <w:p/>
     <w:p/>
     <w:p>
       <w:pPr>
@@ -1031,6 +1019,7 @@
         <w:rPr>
           <w:rFonts w:hint="eastAsia"/>
         </w:rPr>
+        <w:lastRenderedPageBreak/>
         <w:t>最下面未完成录入删掉</w:t>
       </w:r>
     </w:p>
@@ -1097,7 +1086,6 @@
         <w:rPr>
           <w:noProof/>
         </w:rPr>
-        <w:lastRenderedPageBreak/>
         <w:drawing>
           <wp:inline distT="0" distB="0" distL="114300" distR="114300" wp14:anchorId="4265F3EA" wp14:editId="5C4B3FEF">
             <wp:extent cx="5267960" cy="2074545"/>
@@ -1240,6 +1228,7 @@
         <w:rPr>
           <w:noProof/>
         </w:rPr>
+        <w:lastRenderedPageBreak/>
         <w:drawing>
           <wp:inline distT="0" distB="0" distL="114300" distR="114300" wp14:anchorId="107CA2F6" wp14:editId="1884793B">
             <wp:extent cx="5261610" cy="1106170"/>
@@ -1296,7 +1285,6 @@
         <w:rPr>
           <w:noProof/>
         </w:rPr>
-        <w:lastRenderedPageBreak/>
         <w:drawing>
           <wp:inline distT="0" distB="0" distL="114300" distR="114300" wp14:anchorId="2D2B9950" wp14:editId="7CA55379">
             <wp:extent cx="5273040" cy="2625725"/>
@@ -1485,6 +1473,7 @@
         <w:rPr>
           <w:rFonts w:hint="eastAsia"/>
         </w:rPr>
+        <w:lastRenderedPageBreak/>
         <w:t>给一个链接录入格式参考案例</w:t>
       </w:r>
     </w:p>
@@ -1494,7 +1483,6 @@
         <w:rPr>
           <w:noProof/>
         </w:rPr>
-        <w:lastRenderedPageBreak/>
         <w:drawing>
           <wp:inline distT="0" distB="0" distL="114300" distR="114300" wp14:anchorId="77D0941E" wp14:editId="17CF498C">
             <wp:extent cx="5267325" cy="2661285"/>
@@ -1941,110 +1929,84 @@
     </w:p>
     <w:p/>
     <w:p>
+      <w:r>
+        <w:rPr>
+          <w:rFonts w:hint="eastAsia"/>
+        </w:rPr>
+        <w:t>当前页面无法直接按月、年等维度筛选数据，需要手动选择起止日期，操作不便。</w:t>
+      </w:r>
+    </w:p>
+    <w:p>
+      <w:r>
+        <w:rPr>
+          <w:rFonts w:hint="eastAsia"/>
+        </w:rPr>
+        <w:t>单平台的数据筛选功能存在问题，无法正常显示。</w:t>
+      </w:r>
+    </w:p>
+    <w:p>
+      <w:r>
+        <w:t xml:space="preserve">​​2. </w:t>
+      </w:r>
+      <w:r>
+        <w:rPr>
+          <w:rFonts w:hint="eastAsia"/>
+        </w:rPr>
+        <w:t>界面布局与信息展示</w:t>
+      </w:r>
+      <w:r>
+        <w:rPr>
+          <w:rFonts w:ascii="MS Gothic" w:eastAsia="MS Gothic" w:hAnsi="MS Gothic" w:cs="MS Gothic" w:hint="eastAsia"/>
+        </w:rPr>
+        <w:t>​​</w:t>
+      </w:r>
+    </w:p>
+    <w:p/>
+    <w:p>
+      <w:r>
+        <w:rPr>
+          <w:rFonts w:hint="eastAsia"/>
+        </w:rPr>
+        <w:t>“全部作品”页面的信息展示过于臃肿，建议调整布局，将封面、标题、文案等核心信息置于更突出的位置。</w:t>
+      </w:r>
+    </w:p>
+    <w:p>
+      <w:r>
+        <w:rPr>
+          <w:rFonts w:hint="eastAsia"/>
+        </w:rPr>
+        <w:t>“标记为优秀作品”的按钮位置不佳，建议移至更合适的位置。</w:t>
+      </w:r>
+    </w:p>
+    <w:p>
+      <w:r>
+        <w:rPr>
+          <w:rFonts w:hint="eastAsia"/>
+        </w:rPr>
+        <w:t>“高级筛选”区域过宽，建议调整布局使其更紧凑。</w:t>
+      </w:r>
+    </w:p>
+    <w:p>
+      <w:r>
+        <w:t xml:space="preserve">​​3. </w:t>
+      </w:r>
+      <w:r>
+        <w:rPr>
+          <w:rFonts w:hint="eastAsia"/>
+        </w:rPr>
+        <w:t>新增作品与数据来源</w:t>
+      </w:r>
+      <w:r>
+        <w:rPr>
+          <w:rFonts w:ascii="MS Gothic" w:eastAsia="MS Gothic" w:hAnsi="MS Gothic" w:cs="MS Gothic" w:hint="eastAsia"/>
+        </w:rPr>
+        <w:t>​​</w:t>
+      </w:r>
+    </w:p>
+    <w:p/>
+    <w:p>
       <w:pPr>
         <w:rPr>
-          <w:rFonts w:hint="eastAsia"/>
-        </w:rPr>
-      </w:pPr>
-      <w:r>
-        <w:rPr>
-          <w:rFonts w:hint="eastAsia"/>
-        </w:rPr>
-        <w:t>当前页面无法直接按月、年等维度筛选数据，需要手动选择起止日期，操作不便。</w:t>
-      </w:r>
-    </w:p>
-    <w:p>
-      <w:pPr>
-        <w:rPr>
-          <w:rFonts w:hint="eastAsia"/>
-        </w:rPr>
-      </w:pPr>
-      <w:r>
-        <w:rPr>
-          <w:rFonts w:hint="eastAsia"/>
-        </w:rPr>
-        <w:t>单平台的数据筛选功能存在问题，无法正常显示。</w:t>
-      </w:r>
-    </w:p>
-    <w:p>
-      <w:r>
-        <w:t xml:space="preserve">​​2. </w:t>
-      </w:r>
-      <w:r>
-        <w:rPr>
-          <w:rFonts w:hint="eastAsia"/>
-        </w:rPr>
-        <w:t>界面布局与信息展示</w:t>
-      </w:r>
-      <w:r>
-        <w:rPr>
-          <w:rFonts w:ascii="MS Gothic" w:eastAsia="MS Gothic" w:hAnsi="MS Gothic" w:cs="MS Gothic" w:hint="eastAsia"/>
-        </w:rPr>
-        <w:t>​​</w:t>
-      </w:r>
-    </w:p>
-    <w:p/>
-    <w:p>
-      <w:pPr>
-        <w:rPr>
-          <w:rFonts w:hint="eastAsia"/>
-        </w:rPr>
-      </w:pPr>
-      <w:r>
-        <w:rPr>
-          <w:rFonts w:hint="eastAsia"/>
-        </w:rPr>
-        <w:t>“全部作品”页面的信息展示过于臃肿，建议调整布局，将封面、标题、文案等核心信息置于更突出的位置。</w:t>
-      </w:r>
-    </w:p>
-    <w:p>
-      <w:pPr>
-        <w:rPr>
-          <w:rFonts w:hint="eastAsia"/>
-        </w:rPr>
-      </w:pPr>
-      <w:r>
-        <w:rPr>
-          <w:rFonts w:hint="eastAsia"/>
-        </w:rPr>
-        <w:t>“标记为优秀作品”的按钮位置不佳，建议移至更合适的位置。</w:t>
-      </w:r>
-    </w:p>
-    <w:p>
-      <w:pPr>
-        <w:rPr>
-          <w:rFonts w:hint="eastAsia"/>
-        </w:rPr>
-      </w:pPr>
-      <w:r>
-        <w:rPr>
-          <w:rFonts w:hint="eastAsia"/>
-        </w:rPr>
-        <w:t>“高级筛选”区域过宽，建议调整布局使其更紧凑。</w:t>
-      </w:r>
-    </w:p>
-    <w:p>
-      <w:r>
-        <w:t xml:space="preserve">​​3. </w:t>
-      </w:r>
-      <w:r>
-        <w:rPr>
-          <w:rFonts w:hint="eastAsia"/>
-        </w:rPr>
-        <w:t>新增作品与数据来源</w:t>
-      </w:r>
-      <w:r>
-        <w:rPr>
-          <w:rFonts w:ascii="MS Gothic" w:eastAsia="MS Gothic" w:hAnsi="MS Gothic" w:cs="MS Gothic" w:hint="eastAsia"/>
-        </w:rPr>
-        <w:t>​​</w:t>
-      </w:r>
-    </w:p>
-    <w:p/>
-    <w:p>
-      <w:pPr>
-        <w:rPr>
-          <w:rFonts w:hint="eastAsia"/>
           <w:highlight w:val="yellow"/>
         </w:rPr>
       </w:pPr>

</xml_diff>